<commit_message>
report: fill the Phase 1 access block identifiers
Fills the five fields that are now objective facts: student name, student
identifier, repository address, collaborator invitation date and status.
The full commit identifier stays blank until the phase1-analytics tag exists,
so that the value recorded in the report cannot drift from the tagged commit.

check_report_compliance.py: PASS (body 1178 words, 1 table, 1 figure).
</commit_message>
<xml_diff>
--- a/reports/COMM7660_Phase1_report.docx
+++ b/reports/COMM7660_Phase1_report.docx
@@ -18,11 +18,11 @@
         <w:br/>
       </w:r>
       <w:r>
-        <w:t>Student: ____________________</w:t>
+        <w:t>Student: Cao Yuquan</w:t>
         <w:br/>
       </w:r>
       <w:r>
-        <w:t>Student identifier: ____________</w:t>
+        <w:t>Student identifier: 26366290</w:t>
         <w:br/>
       </w:r>
       <w:r>
@@ -30,11 +30,11 @@
         <w:br/>
       </w:r>
       <w:r>
-        <w:t>Repository: _(GitHub URL to be entered by the student)_</w:t>
+        <w:t>Repository: https://github.com/706617514-blip/COMM7660-CaoYuquan-ReceptionBaseline</w:t>
         <w:br/>
       </w:r>
       <w:r>
-        <w:t>Collaborator: fffchaobu — invited _(date)_ — status _(pending / accepted)_</w:t>
+        <w:t>Collaborator: fffchaobu — invited 2026-10-13 — status pending</w:t>
         <w:br/>
       </w:r>
       <w:r>

</xml_diff>